<commit_message>
Synchronize Version 6 DOI references
</commit_message>
<xml_diff>
--- a/manuscript/Submission_Paper_PRXQ_V6.docx
+++ b/manuscript/Submission_Paper_PRXQ_V6.docx
@@ -98,6 +98,7 @@
     </w:p>
     <w:p>
       <w:r>
+        <w:lastRenderedPageBreak/>
         <w:t>Why this matters now. Quantum-switch experiments and certification methods have advanced rapidly [15,21-23], while recent theoretical and experimental work has sharpened the conditions for Quantum Darwinism, strong objectivity, and spectrum-broadcast structure [17,18,20,24]. Without a separation theorem, a gain in one controlled-order task can be mistaken for improved objectivity, and a causal certificate can be mistaken for a record certificate. The present framework gives both communities a common diagnostic language: identify the accessible systems, specify the comparator, separate redundant records from joint control-fragment information, and certify causal structure independently.</w:t>
       </w:r>
     </w:p>
@@ -645,11 +646,7 @@
             <w:pPr>
               <w:spacing w:after="40" w:line="240" w:lineRule="auto"/>
             </w:pPr>
-            <w:r/>
-            <w:r>
-              <w:rPr>
-                <w:b w:val="0"/>
-              </w:rPr>
+            <w:r>
               <w:t>Supporting certification and test</w:t>
             </w:r>
           </w:p>
@@ -669,11 +666,7 @@
             <w:pPr>
               <w:spacing w:after="40" w:line="240" w:lineRule="auto"/>
             </w:pPr>
-            <w:r/>
-            <w:r>
-              <w:rPr>
-                <w:b w:val="0"/>
-              </w:rPr>
+            <w:r>
               <w:t>Does deterministic record augmentation preserve an existing causal certificate?</w:t>
             </w:r>
           </w:p>
@@ -693,11 +686,7 @@
             <w:pPr>
               <w:spacing w:after="40" w:line="240" w:lineRule="auto"/>
             </w:pPr>
-            <w:r/>
-            <w:r>
-              <w:rPr>
-                <w:b w:val="0"/>
-              </w:rPr>
+            <w:r>
               <w:t>Yes under deterministic local recovery; used as a supporting witness-pullback check.</w:t>
             </w:r>
           </w:p>
@@ -717,11 +706,7 @@
             <w:pPr>
               <w:spacing w:after="40" w:line="240" w:lineRule="auto"/>
             </w:pPr>
-            <w:r/>
-            <w:r>
-              <w:rPr>
-                <w:b w:val="0"/>
-              </w:rPr>
+            <w:r>
               <w:t>Proposition 1 and Sec. IX</w:t>
             </w:r>
           </w:p>
@@ -751,7 +736,11 @@
     </w:p>
     <w:p>
       <w:r>
-        <w:t>All Hilbert spaces are finite dimensional. Logarithms are base two, so information quantities are measured in bits. The trace norm is ||X||₁=Tr√(X†X). Unless otherwise stated, the binary decision problem uses equal priors. Classical registers are represented by orthogonal basis states, and conditional mutual information is I(A:B|C)=S(AC)+S(BC)-S(C)-S(ABC).</w:t>
+        <w:t xml:space="preserve">All Hilbert spaces are finite dimensional. Logarithms are base two, so information quantities are measured in bits. The trace norm is ||X||₁=Tr√(X†X). Unless otherwise stated, the binary decision problem uses equal priors. Classical </w:t>
+      </w:r>
+      <w:r>
+        <w:lastRenderedPageBreak/>
+        <w:t>registers are represented by orthogonal basis states, and conditional mutual information is I(A:B|C)=S(AC)+S(BC)-S(C)-S(ABC).</w:t>
       </w:r>
     </w:p>
     <w:p>
@@ -1055,7 +1044,6 @@
               <w:rPr>
                 <w:sz w:val="16"/>
               </w:rPr>
-              <w:lastRenderedPageBreak/>
               <w:t>U_A,U_B</w:t>
             </w:r>
           </w:p>
@@ -1508,6 +1496,7 @@
         <w:pStyle w:val="Heading1"/>
       </w:pPr>
       <w:r>
+        <w:lastRenderedPageBreak/>
         <w:t>III. Independence and control-access decomposition</w:t>
       </w:r>
     </w:p>
@@ -1650,7 +1639,6 @@
               <w:rPr>
                 <w:sz w:val="16"/>
               </w:rPr>
-              <w:lastRenderedPageBreak/>
               <w:t>Yes</w:t>
             </w:r>
           </w:p>
@@ -2042,12 +2030,14 @@
               <w:rPr>
                 <w:b/>
               </w:rPr>
+              <w:t xml:space="preserve">Definition 2. Exact pointer preservation. The pointer projectors {Qλ} act on the pointer-system Hilbert space H_S and are lifted to larger spaces by tensoring with identity operators on every nonpointer subsystem present in the expression. Thus Qλ means Qλ^S on S, I_T⊗Qλ^S in the controlled-order operator, and I_T⊗Qλ^S⊗I_E on explicit record spaces. An operator V preserves the pointer projectors exactly when [V,Qλ]=0 for every λ after this identity extension. This operator-level condition is equivalent to </w:t>
             </w:r>
             <w:r>
               <w:rPr>
                 <w:b/>
               </w:rPr>
-              <w:t>Definition 2. Exact pointer preservation. The pointer projectors {Qλ} act on the pointer-system Hilbert space H_S and are lifted to larger spaces by tensoring with identity operators on every nonpointer subsystem present in the expression. Thus Qλ means Qλ^S on S, I_T⊗Qλ^S in the controlled-order operator, and I_T⊗Qλ^S⊗I_E on explicit record spaces. An operator V preserves the pointer projectors exactly when [V,Qλ]=0 for every λ after this identity extension. This operator-level condition is equivalent to block-diagonality in the pointer-sector decomposition and prevents transitions between pointer sectors. The controlled-rotation gates in Eqs. (18)-(19) are record-writing interactions conditioned on the pointer basis; they preserve the Z pointer exactly when their system-side action is block diagonal in {Qλ}. The θ-rotated record interaction is therefore not a common-pointer-preserving interaction except in the compatible limits identified by the branchwise criteria.</w:t>
+              <w:lastRenderedPageBreak/>
+              <w:t>block-diagonality in the pointer-sector decomposition and prevents transitions between pointer sectors. The controlled-rotation gates in Eqs. (18)-(19) are record-writing interactions conditioned on the pointer basis; they preserve the Z pointer exactly when their system-side action is block diagonal in {Qλ}. The θ-rotated record interaction is therefore not a common-pointer-preserving interaction except in the compatible limits identified by the branchwise criteria.</w:t>
             </w:r>
           </w:p>
         </w:tc>
@@ -2094,11 +2084,7 @@
     </w:p>
     <w:p>
       <w:r>
-        <w:t xml:space="preserve">The terms occupy orthogonal control blocks, so cross-order coherence cannot cancel operator-level leakage. For a projector Qλ, define the nonnegative Hilbert-Schmidt leakage Lλ(V)=||(I-Qλ)VQλ||₂². With initial control branch weights p₀ and p₁, tracing out T gives Lλ(U_ord)=p₀Lλ(U_B U_A)+p₁Lλ(U_A U_B). Thus zero unconditional leakage with both weights nonzero is equivalent to zero leakage in each occupied branch. If one branch has zero </w:t>
-      </w:r>
-      <w:r>
-        <w:lastRenderedPageBreak/>
-        <w:t>weight, necessity applies only to the occupied branch. The same conclusion holds for any nonnegative leakage functional additive on orthogonal control blocks.</w:t>
+        <w:t>The terms occupy orthogonal control blocks, so cross-order coherence cannot cancel operator-level leakage. For a projector Qλ, define the nonnegative Hilbert-Schmidt leakage Lλ(V)=||(I-Qλ)VQλ||₂². With initial control branch weights p₀ and p₁, tracing out T gives Lλ(U_ord)=p₀Lλ(U_B U_A)+p₁Lλ(U_A U_B). Thus zero unconditional leakage with both weights nonzero is equivalent to zero leakage in each occupied branch. If one branch has zero weight, necessity applies only to the occupied branch. The same conclusion holds for any nonnegative leakage functional additive on orthogonal control blocks.</w:t>
       </w:r>
     </w:p>
     <w:p>
@@ -2192,6 +2178,7 @@
     </w:p>
     <w:p>
       <w:r>
+        <w:lastRenderedPageBreak/>
         <w:t>For the declared binary record model, the symbolic certificate constructs the physical-basis operators and verifies a unitary reduction to the following spectral normal forms. Let s=sin(α_B/2)cosθ. There exist unitaries V_AB, V_BA, and V_coh such that</w:t>
       </w:r>
     </w:p>
@@ -2260,7 +2247,6 @@
     </w:p>
     <w:p>
       <w:r>
-        <w:lastRenderedPageBreak/>
         <w:t>This equality is not a generic statement that coherent order is useless. Holevo information depends on the spectra of the individual conditional states and their average, not only on the binary trace norm. Biased priors replace Δ by π₀ρ₀-π₁ρ₁, introducing a noncanceling common-state term; consequently the factorization in Eq. (11) need not hold. The result is therefore an exact, task-specific no-advantage theorem.</w:t>
       </w:r>
     </w:p>
@@ -2299,9 +2285,9 @@
     <w:tbl>
       <w:tblPr>
         <w:tblStyle w:val="TableGrid"/>
-        <w:tblW w:type="auto" w:w="0"/>
+        <w:tblW w:w="0" w:type="auto"/>
         <w:jc w:val="center"/>
-        <w:tblLook w:firstColumn="1" w:firstRow="1" w:lastColumn="0" w:lastRow="0" w:noHBand="0" w:noVBand="1" w:val="04A0"/>
+        <w:tblLook w:val="04A0" w:firstRow="1" w:lastRow="0" w:firstColumn="1" w:lastColumn="0" w:noHBand="0" w:noVBand="1"/>
       </w:tblPr>
       <w:tblGrid>
         <w:gridCol w:w="2469"/>
@@ -2310,27 +2296,25 @@
         <w:gridCol w:w="2469"/>
       </w:tblGrid>
       <w:tr>
-        <w:tc>
-          <w:tcPr>
-            <w:tcW w:type="dxa" w:w="2469"/>
+        <w:trPr>
+          <w:jc w:val="center"/>
+        </w:trPr>
+        <w:tc>
+          <w:tcPr>
+            <w:tcW w:w="2469" w:type="dxa"/>
+            <w:shd w:val="clear" w:color="auto" w:fill="D9EAF7"/>
+            <w:tcMar>
+              <w:top w:w="90" w:type="dxa"/>
+              <w:left w:w="90" w:type="dxa"/>
+              <w:bottom w:w="90" w:type="dxa"/>
+              <w:right w:w="90" w:type="dxa"/>
+            </w:tcMar>
             <w:vAlign w:val="center"/>
-            <w:tcMar>
-              <w:top w:w="90" w:type="dxa"/>
-              <w:left w:w="90" w:type="dxa"/>
-              <w:bottom w:w="90" w:type="dxa"/>
-              <w:right w:w="90" w:type="dxa"/>
-            </w:tcMar>
-            <w:shd w:fill="D9EAF7"/>
           </w:tcPr>
           <w:p>
             <w:pPr>
               <w:spacing w:after="40" w:line="240" w:lineRule="auto"/>
             </w:pPr>
-            <w:r>
-              <w:rPr>
-                <w:b/>
-              </w:rPr>
-            </w:r>
             <w:r>
               <w:rPr>
                 <w:b/>
@@ -2341,25 +2325,20 @@
         </w:tc>
         <w:tc>
           <w:tcPr>
-            <w:tcW w:type="dxa" w:w="2469"/>
+            <w:tcW w:w="2469" w:type="dxa"/>
+            <w:shd w:val="clear" w:color="auto" w:fill="D9EAF7"/>
+            <w:tcMar>
+              <w:top w:w="90" w:type="dxa"/>
+              <w:left w:w="90" w:type="dxa"/>
+              <w:bottom w:w="90" w:type="dxa"/>
+              <w:right w:w="90" w:type="dxa"/>
+            </w:tcMar>
             <w:vAlign w:val="center"/>
-            <w:tcMar>
-              <w:top w:w="90" w:type="dxa"/>
-              <w:left w:w="90" w:type="dxa"/>
-              <w:bottom w:w="90" w:type="dxa"/>
-              <w:right w:w="90" w:type="dxa"/>
-            </w:tcMar>
-            <w:shd w:fill="D9EAF7"/>
           </w:tcPr>
           <w:p>
             <w:pPr>
               <w:spacing w:after="40" w:line="240" w:lineRule="auto"/>
             </w:pPr>
-            <w:r>
-              <w:rPr>
-                <w:b/>
-              </w:rPr>
-            </w:r>
             <w:r>
               <w:rPr>
                 <w:b/>
@@ -2370,25 +2349,20 @@
         </w:tc>
         <w:tc>
           <w:tcPr>
-            <w:tcW w:type="dxa" w:w="2469"/>
+            <w:tcW w:w="2469" w:type="dxa"/>
+            <w:shd w:val="clear" w:color="auto" w:fill="D9EAF7"/>
+            <w:tcMar>
+              <w:top w:w="90" w:type="dxa"/>
+              <w:left w:w="90" w:type="dxa"/>
+              <w:bottom w:w="90" w:type="dxa"/>
+              <w:right w:w="90" w:type="dxa"/>
+            </w:tcMar>
             <w:vAlign w:val="center"/>
-            <w:tcMar>
-              <w:top w:w="90" w:type="dxa"/>
-              <w:left w:w="90" w:type="dxa"/>
-              <w:bottom w:w="90" w:type="dxa"/>
-              <w:right w:w="90" w:type="dxa"/>
-            </w:tcMar>
-            <w:shd w:fill="D9EAF7"/>
           </w:tcPr>
           <w:p>
             <w:pPr>
               <w:spacing w:after="40" w:line="240" w:lineRule="auto"/>
             </w:pPr>
-            <w:r>
-              <w:rPr>
-                <w:b/>
-              </w:rPr>
-            </w:r>
             <w:r>
               <w:rPr>
                 <w:b/>
@@ -2399,25 +2373,20 @@
         </w:tc>
         <w:tc>
           <w:tcPr>
-            <w:tcW w:type="dxa" w:w="2469"/>
+            <w:tcW w:w="2469" w:type="dxa"/>
+            <w:shd w:val="clear" w:color="auto" w:fill="D9EAF7"/>
+            <w:tcMar>
+              <w:top w:w="90" w:type="dxa"/>
+              <w:left w:w="90" w:type="dxa"/>
+              <w:bottom w:w="90" w:type="dxa"/>
+              <w:right w:w="90" w:type="dxa"/>
+            </w:tcMar>
             <w:vAlign w:val="center"/>
-            <w:tcMar>
-              <w:top w:w="90" w:type="dxa"/>
-              <w:left w:w="90" w:type="dxa"/>
-              <w:bottom w:w="90" w:type="dxa"/>
-              <w:right w:w="90" w:type="dxa"/>
-            </w:tcMar>
-            <w:shd w:fill="D9EAF7"/>
           </w:tcPr>
           <w:p>
             <w:pPr>
               <w:spacing w:after="40" w:line="240" w:lineRule="auto"/>
             </w:pPr>
-            <w:r>
-              <w:rPr>
-                <w:b/>
-              </w:rPr>
-            </w:r>
             <w:r>
               <w:rPr>
                 <w:b/>
@@ -2428,491 +2397,440 @@
         </w:tc>
       </w:tr>
       <w:tr>
-        <w:tc>
-          <w:tcPr>
-            <w:tcW w:type="dxa" w:w="2469"/>
+        <w:trPr>
+          <w:jc w:val="center"/>
+        </w:trPr>
+        <w:tc>
+          <w:tcPr>
+            <w:tcW w:w="2469" w:type="dxa"/>
+            <w:tcMar>
+              <w:top w:w="90" w:type="dxa"/>
+              <w:left w:w="90" w:type="dxa"/>
+              <w:bottom w:w="90" w:type="dxa"/>
+              <w:right w:w="90" w:type="dxa"/>
+            </w:tcMar>
             <w:vAlign w:val="center"/>
-            <w:tcMar>
-              <w:top w:w="90" w:type="dxa"/>
-              <w:left w:w="90" w:type="dxa"/>
-              <w:bottom w:w="90" w:type="dxa"/>
-              <w:right w:w="90" w:type="dxa"/>
-            </w:tcMar>
           </w:tcPr>
           <w:p>
             <w:pPr>
               <w:spacing w:after="40" w:line="240" w:lineRule="auto"/>
             </w:pPr>
-            <w:r/>
-            <w:r>
-              <w:rPr>
-                <w:b w:val="0"/>
-              </w:rPr>
+            <w:r>
               <w:t>Fixed AB order</w:t>
             </w:r>
           </w:p>
         </w:tc>
         <w:tc>
           <w:tcPr>
-            <w:tcW w:type="dxa" w:w="2469"/>
+            <w:tcW w:w="2469" w:type="dxa"/>
+            <w:tcMar>
+              <w:top w:w="90" w:type="dxa"/>
+              <w:left w:w="90" w:type="dxa"/>
+              <w:bottom w:w="90" w:type="dxa"/>
+              <w:right w:w="90" w:type="dxa"/>
+            </w:tcMar>
             <w:vAlign w:val="center"/>
-            <w:tcMar>
-              <w:top w:w="90" w:type="dxa"/>
-              <w:left w:w="90" w:type="dxa"/>
-              <w:bottom w:w="90" w:type="dxa"/>
-              <w:right w:w="90" w:type="dxa"/>
-            </w:tcMar>
           </w:tcPr>
           <w:p>
             <w:pPr>
               <w:spacing w:after="40" w:line="240" w:lineRule="auto"/>
             </w:pPr>
-            <w:r/>
-            <w:r>
-              <w:rPr>
-                <w:b w:val="0"/>
-              </w:rPr>
+            <w:r>
               <w:t>Yes</w:t>
             </w:r>
           </w:p>
         </w:tc>
         <w:tc>
           <w:tcPr>
-            <w:tcW w:type="dxa" w:w="2469"/>
+            <w:tcW w:w="2469" w:type="dxa"/>
+            <w:tcMar>
+              <w:top w:w="90" w:type="dxa"/>
+              <w:left w:w="90" w:type="dxa"/>
+              <w:bottom w:w="90" w:type="dxa"/>
+              <w:right w:w="90" w:type="dxa"/>
+            </w:tcMar>
             <w:vAlign w:val="center"/>
-            <w:tcMar>
-              <w:top w:w="90" w:type="dxa"/>
-              <w:left w:w="90" w:type="dxa"/>
-              <w:bottom w:w="90" w:type="dxa"/>
-              <w:right w:w="90" w:type="dxa"/>
-            </w:tcMar>
           </w:tcPr>
           <w:p>
             <w:pPr>
               <w:spacing w:after="40" w:line="240" w:lineRule="auto"/>
             </w:pPr>
-            <w:r/>
-            <w:r>
-              <w:rPr>
-                <w:b w:val="0"/>
-              </w:rPr>
+            <w:r>
               <w:t>Baseline definite order</w:t>
             </w:r>
           </w:p>
         </w:tc>
         <w:tc>
           <w:tcPr>
-            <w:tcW w:type="dxa" w:w="2469"/>
+            <w:tcW w:w="2469" w:type="dxa"/>
+            <w:tcMar>
+              <w:top w:w="90" w:type="dxa"/>
+              <w:left w:w="90" w:type="dxa"/>
+              <w:bottom w:w="90" w:type="dxa"/>
+              <w:right w:w="90" w:type="dxa"/>
+            </w:tcMar>
             <w:vAlign w:val="center"/>
-            <w:tcMar>
-              <w:top w:w="90" w:type="dxa"/>
-              <w:left w:w="90" w:type="dxa"/>
-              <w:bottom w:w="90" w:type="dxa"/>
-              <w:right w:w="90" w:type="dxa"/>
-            </w:tcMar>
           </w:tcPr>
           <w:p>
             <w:pPr>
               <w:spacing w:after="40" w:line="240" w:lineRule="auto"/>
             </w:pPr>
-            <w:r/>
-            <w:r>
-              <w:rPr>
-                <w:b w:val="0"/>
-              </w:rPr>
+            <w:r>
               <w:t>Directly computed</w:t>
             </w:r>
           </w:p>
         </w:tc>
       </w:tr>
       <w:tr>
-        <w:tc>
-          <w:tcPr>
-            <w:tcW w:type="dxa" w:w="2469"/>
+        <w:trPr>
+          <w:jc w:val="center"/>
+        </w:trPr>
+        <w:tc>
+          <w:tcPr>
+            <w:tcW w:w="2469" w:type="dxa"/>
+            <w:tcMar>
+              <w:top w:w="90" w:type="dxa"/>
+              <w:left w:w="90" w:type="dxa"/>
+              <w:bottom w:w="90" w:type="dxa"/>
+              <w:right w:w="90" w:type="dxa"/>
+            </w:tcMar>
             <w:vAlign w:val="center"/>
-            <w:tcMar>
-              <w:top w:w="90" w:type="dxa"/>
-              <w:left w:w="90" w:type="dxa"/>
-              <w:bottom w:w="90" w:type="dxa"/>
-              <w:right w:w="90" w:type="dxa"/>
-            </w:tcMar>
           </w:tcPr>
           <w:p>
             <w:pPr>
               <w:spacing w:after="40" w:line="240" w:lineRule="auto"/>
             </w:pPr>
-            <w:r/>
-            <w:r>
-              <w:rPr>
-                <w:b w:val="0"/>
-              </w:rPr>
+            <w:r>
               <w:t>Fixed BA order</w:t>
             </w:r>
           </w:p>
         </w:tc>
         <w:tc>
           <w:tcPr>
-            <w:tcW w:type="dxa" w:w="2469"/>
+            <w:tcW w:w="2469" w:type="dxa"/>
+            <w:tcMar>
+              <w:top w:w="90" w:type="dxa"/>
+              <w:left w:w="90" w:type="dxa"/>
+              <w:bottom w:w="90" w:type="dxa"/>
+              <w:right w:w="90" w:type="dxa"/>
+            </w:tcMar>
             <w:vAlign w:val="center"/>
-            <w:tcMar>
-              <w:top w:w="90" w:type="dxa"/>
-              <w:left w:w="90" w:type="dxa"/>
-              <w:bottom w:w="90" w:type="dxa"/>
-              <w:right w:w="90" w:type="dxa"/>
-            </w:tcMar>
           </w:tcPr>
           <w:p>
             <w:pPr>
               <w:spacing w:after="40" w:line="240" w:lineRule="auto"/>
             </w:pPr>
-            <w:r/>
-            <w:r>
-              <w:rPr>
-                <w:b w:val="0"/>
-              </w:rPr>
+            <w:r>
               <w:t>Yes</w:t>
             </w:r>
           </w:p>
         </w:tc>
         <w:tc>
           <w:tcPr>
-            <w:tcW w:type="dxa" w:w="2469"/>
+            <w:tcW w:w="2469" w:type="dxa"/>
+            <w:tcMar>
+              <w:top w:w="90" w:type="dxa"/>
+              <w:left w:w="90" w:type="dxa"/>
+              <w:bottom w:w="90" w:type="dxa"/>
+              <w:right w:w="90" w:type="dxa"/>
+            </w:tcMar>
             <w:vAlign w:val="center"/>
-            <w:tcMar>
-              <w:top w:w="90" w:type="dxa"/>
-              <w:left w:w="90" w:type="dxa"/>
-              <w:bottom w:w="90" w:type="dxa"/>
-              <w:right w:w="90" w:type="dxa"/>
-            </w:tcMar>
           </w:tcPr>
           <w:p>
             <w:pPr>
               <w:spacing w:after="40" w:line="240" w:lineRule="auto"/>
             </w:pPr>
-            <w:r/>
-            <w:r>
-              <w:rPr>
-                <w:b w:val="0"/>
-              </w:rPr>
+            <w:r>
               <w:t>Opposite definite-order baseline</w:t>
             </w:r>
           </w:p>
         </w:tc>
         <w:tc>
           <w:tcPr>
-            <w:tcW w:type="dxa" w:w="2469"/>
+            <w:tcW w:w="2469" w:type="dxa"/>
+            <w:tcMar>
+              <w:top w:w="90" w:type="dxa"/>
+              <w:left w:w="90" w:type="dxa"/>
+              <w:bottom w:w="90" w:type="dxa"/>
+              <w:right w:w="90" w:type="dxa"/>
+            </w:tcMar>
             <w:vAlign w:val="center"/>
-            <w:tcMar>
-              <w:top w:w="90" w:type="dxa"/>
-              <w:left w:w="90" w:type="dxa"/>
-              <w:bottom w:w="90" w:type="dxa"/>
-              <w:right w:w="90" w:type="dxa"/>
-            </w:tcMar>
           </w:tcPr>
           <w:p>
             <w:pPr>
               <w:spacing w:after="40" w:line="240" w:lineRule="auto"/>
             </w:pPr>
-            <w:r/>
-            <w:r>
-              <w:rPr>
-                <w:b w:val="0"/>
-              </w:rPr>
+            <w:r>
               <w:t>Directly computed</w:t>
             </w:r>
           </w:p>
         </w:tc>
       </w:tr>
       <w:tr>
-        <w:tc>
-          <w:tcPr>
-            <w:tcW w:type="dxa" w:w="2469"/>
+        <w:trPr>
+          <w:jc w:val="center"/>
+        </w:trPr>
+        <w:tc>
+          <w:tcPr>
+            <w:tcW w:w="2469" w:type="dxa"/>
+            <w:tcMar>
+              <w:top w:w="90" w:type="dxa"/>
+              <w:left w:w="90" w:type="dxa"/>
+              <w:bottom w:w="90" w:type="dxa"/>
+              <w:right w:w="90" w:type="dxa"/>
+            </w:tcMar>
             <w:vAlign w:val="center"/>
-            <w:tcMar>
-              <w:top w:w="90" w:type="dxa"/>
-              <w:left w:w="90" w:type="dxa"/>
-              <w:bottom w:w="90" w:type="dxa"/>
-              <w:right w:w="90" w:type="dxa"/>
-            </w:tcMar>
           </w:tcPr>
           <w:p>
             <w:pPr>
               <w:spacing w:after="40" w:line="240" w:lineRule="auto"/>
             </w:pPr>
-            <w:r/>
-            <w:r>
-              <w:rPr>
-                <w:b w:val="0"/>
-              </w:rPr>
+            <w:r>
               <w:t>Optimized fixed-order mixture</w:t>
             </w:r>
           </w:p>
         </w:tc>
         <w:tc>
           <w:tcPr>
-            <w:tcW w:type="dxa" w:w="2469"/>
+            <w:tcW w:w="2469" w:type="dxa"/>
+            <w:tcMar>
+              <w:top w:w="90" w:type="dxa"/>
+              <w:left w:w="90" w:type="dxa"/>
+              <w:bottom w:w="90" w:type="dxa"/>
+              <w:right w:w="90" w:type="dxa"/>
+            </w:tcMar>
             <w:vAlign w:val="center"/>
-            <w:tcMar>
-              <w:top w:w="90" w:type="dxa"/>
-              <w:left w:w="90" w:type="dxa"/>
-              <w:bottom w:w="90" w:type="dxa"/>
-              <w:right w:w="90" w:type="dxa"/>
-            </w:tcMar>
           </w:tcPr>
           <w:p>
             <w:pPr>
               <w:spacing w:after="40" w:line="240" w:lineRule="auto"/>
             </w:pPr>
-            <w:r/>
-            <w:r>
-              <w:rPr>
-                <w:b w:val="0"/>
-              </w:rPr>
+            <w:r>
               <w:t>For environment-only access</w:t>
             </w:r>
           </w:p>
         </w:tc>
         <w:tc>
           <w:tcPr>
-            <w:tcW w:type="dxa" w:w="2469"/>
+            <w:tcW w:w="2469" w:type="dxa"/>
+            <w:tcMar>
+              <w:top w:w="90" w:type="dxa"/>
+              <w:left w:w="90" w:type="dxa"/>
+              <w:bottom w:w="90" w:type="dxa"/>
+              <w:right w:w="90" w:type="dxa"/>
+            </w:tcMar>
             <w:vAlign w:val="center"/>
-            <w:tcMar>
-              <w:top w:w="90" w:type="dxa"/>
-              <w:left w:w="90" w:type="dxa"/>
-              <w:bottom w:w="90" w:type="dxa"/>
-              <w:right w:w="90" w:type="dxa"/>
-            </w:tcMar>
           </w:tcPr>
           <w:p>
             <w:pPr>
               <w:spacing w:after="40" w:line="240" w:lineRule="auto"/>
             </w:pPr>
-            <w:r/>
-            <w:r>
-              <w:rPr>
-                <w:b w:val="0"/>
-              </w:rPr>
+            <w:r>
               <w:t>Checks whether discarded control merely reproduces a mixture</w:t>
             </w:r>
           </w:p>
         </w:tc>
         <w:tc>
           <w:tcPr>
-            <w:tcW w:type="dxa" w:w="2469"/>
+            <w:tcW w:w="2469" w:type="dxa"/>
+            <w:tcMar>
+              <w:top w:w="90" w:type="dxa"/>
+              <w:left w:w="90" w:type="dxa"/>
+              <w:bottom w:w="90" w:type="dxa"/>
+              <w:right w:w="90" w:type="dxa"/>
+            </w:tcMar>
             <w:vAlign w:val="center"/>
-            <w:tcMar>
-              <w:top w:w="90" w:type="dxa"/>
-              <w:left w:w="90" w:type="dxa"/>
-              <w:bottom w:w="90" w:type="dxa"/>
-              <w:right w:w="90" w:type="dxa"/>
-            </w:tcMar>
           </w:tcPr>
           <w:p>
             <w:pPr>
               <w:spacing w:after="40" w:line="240" w:lineRule="auto"/>
             </w:pPr>
-            <w:r/>
-            <w:r>
-              <w:rPr>
-                <w:b w:val="0"/>
-              </w:rPr>
+            <w:r>
               <w:t>No fragment-only gain found in declared tests</w:t>
             </w:r>
           </w:p>
         </w:tc>
       </w:tr>
       <w:tr>
-        <w:tc>
-          <w:tcPr>
-            <w:tcW w:type="dxa" w:w="2469"/>
+        <w:trPr>
+          <w:jc w:val="center"/>
+        </w:trPr>
+        <w:tc>
+          <w:tcPr>
+            <w:tcW w:w="2469" w:type="dxa"/>
+            <w:tcMar>
+              <w:top w:w="90" w:type="dxa"/>
+              <w:left w:w="90" w:type="dxa"/>
+              <w:bottom w:w="90" w:type="dxa"/>
+              <w:right w:w="90" w:type="dxa"/>
+            </w:tcMar>
             <w:vAlign w:val="center"/>
-            <w:tcMar>
-              <w:top w:w="90" w:type="dxa"/>
-              <w:left w:w="90" w:type="dxa"/>
-              <w:bottom w:w="90" w:type="dxa"/>
-              <w:right w:w="90" w:type="dxa"/>
-            </w:tcMar>
           </w:tcPr>
           <w:p>
             <w:pPr>
               <w:spacing w:after="40" w:line="240" w:lineRule="auto"/>
             </w:pPr>
-            <w:r/>
-            <w:r>
-              <w:rPr>
-                <w:b w:val="0"/>
-              </w:rPr>
+            <w:r>
               <w:t>Resource-matched controlled/fixed family</w:t>
             </w:r>
           </w:p>
         </w:tc>
         <w:tc>
           <w:tcPr>
-            <w:tcW w:type="dxa" w:w="2469"/>
+            <w:tcW w:w="2469" w:type="dxa"/>
+            <w:tcMar>
+              <w:top w:w="90" w:type="dxa"/>
+              <w:left w:w="90" w:type="dxa"/>
+              <w:bottom w:w="90" w:type="dxa"/>
+              <w:right w:w="90" w:type="dxa"/>
+            </w:tcMar>
             <w:vAlign w:val="center"/>
-            <w:tcMar>
-              <w:top w:w="90" w:type="dxa"/>
-              <w:left w:w="90" w:type="dxa"/>
-              <w:bottom w:w="90" w:type="dxa"/>
-              <w:right w:w="90" w:type="dxa"/>
-            </w:tcMar>
           </w:tcPr>
           <w:p>
             <w:pPr>
               <w:spacing w:after="40" w:line="240" w:lineRule="auto"/>
             </w:pPr>
-            <w:r/>
-            <w:r>
-              <w:rPr>
-                <w:b w:val="0"/>
-              </w:rPr>
+            <w:r>
               <w:t>Yes</w:t>
             </w:r>
           </w:p>
         </w:tc>
         <w:tc>
           <w:tcPr>
-            <w:tcW w:type="dxa" w:w="2469"/>
+            <w:tcW w:w="2469" w:type="dxa"/>
+            <w:tcMar>
+              <w:top w:w="90" w:type="dxa"/>
+              <w:left w:w="90" w:type="dxa"/>
+              <w:bottom w:w="90" w:type="dxa"/>
+              <w:right w:w="90" w:type="dxa"/>
+            </w:tcMar>
             <w:vAlign w:val="center"/>
-            <w:tcMar>
-              <w:top w:w="90" w:type="dxa"/>
-              <w:left w:w="90" w:type="dxa"/>
-              <w:bottom w:w="90" w:type="dxa"/>
-              <w:right w:w="90" w:type="dxa"/>
-            </w:tcMar>
           </w:tcPr>
           <w:p>
             <w:pPr>
               <w:spacing w:after="40" w:line="240" w:lineRule="auto"/>
             </w:pPr>
-            <w:r/>
-            <w:r>
-              <w:rPr>
-                <w:b w:val="0"/>
-              </w:rPr>
+            <w:r>
               <w:t>Main fair comparator with same dimensions, states, operation uses, and record resources</w:t>
             </w:r>
           </w:p>
         </w:tc>
         <w:tc>
           <w:tcPr>
-            <w:tcW w:type="dxa" w:w="2469"/>
+            <w:tcW w:w="2469" w:type="dxa"/>
+            <w:tcMar>
+              <w:top w:w="90" w:type="dxa"/>
+              <w:left w:w="90" w:type="dxa"/>
+              <w:bottom w:w="90" w:type="dxa"/>
+              <w:right w:w="90" w:type="dxa"/>
+            </w:tcMar>
             <w:vAlign w:val="center"/>
-            <w:tcMar>
-              <w:top w:w="90" w:type="dxa"/>
-              <w:left w:w="90" w:type="dxa"/>
-              <w:bottom w:w="90" w:type="dxa"/>
-              <w:right w:w="90" w:type="dxa"/>
-            </w:tcMar>
           </w:tcPr>
           <w:p>
             <w:pPr>
               <w:spacing w:after="40" w:line="240" w:lineRule="auto"/>
             </w:pPr>
-            <w:r/>
-            <w:r>
-              <w:rPr>
-                <w:b w:val="0"/>
-              </w:rPr>
+            <w:r>
               <w:t>Joint-access Holevo advantage reported</w:t>
             </w:r>
           </w:p>
         </w:tc>
       </w:tr>
       <w:tr>
-        <w:tc>
-          <w:tcPr>
-            <w:tcW w:type="dxa" w:w="2469"/>
+        <w:trPr>
+          <w:jc w:val="center"/>
+        </w:trPr>
+        <w:tc>
+          <w:tcPr>
+            <w:tcW w:w="2469" w:type="dxa"/>
+            <w:tcMar>
+              <w:top w:w="90" w:type="dxa"/>
+              <w:left w:w="90" w:type="dxa"/>
+              <w:bottom w:w="90" w:type="dxa"/>
+              <w:right w:w="90" w:type="dxa"/>
+            </w:tcMar>
             <w:vAlign w:val="center"/>
-            <w:tcMar>
-              <w:top w:w="90" w:type="dxa"/>
-              <w:left w:w="90" w:type="dxa"/>
-              <w:bottom w:w="90" w:type="dxa"/>
-              <w:right w:w="90" w:type="dxa"/>
-            </w:tcMar>
           </w:tcPr>
           <w:p>
             <w:pPr>
               <w:spacing w:after="40" w:line="240" w:lineRule="auto"/>
             </w:pPr>
-            <w:r/>
-            <w:r>
-              <w:rPr>
-                <w:b w:val="0"/>
-              </w:rPr>
-              <w:t>Full causally separable cone</w:t>
-            </w:r>
-          </w:p>
-        </w:tc>
-        <w:tc>
-          <w:tcPr>
-            <w:tcW w:type="dxa" w:w="2469"/>
+            <w:r>
+              <w:t xml:space="preserve">Full causally separable </w:t>
+            </w:r>
+            <w:r>
+              <w:lastRenderedPageBreak/>
+              <w:t>cone</w:t>
+            </w:r>
+          </w:p>
+        </w:tc>
+        <w:tc>
+          <w:tcPr>
+            <w:tcW w:w="2469" w:type="dxa"/>
+            <w:tcMar>
+              <w:top w:w="90" w:type="dxa"/>
+              <w:left w:w="90" w:type="dxa"/>
+              <w:bottom w:w="90" w:type="dxa"/>
+              <w:right w:w="90" w:type="dxa"/>
+            </w:tcMar>
             <w:vAlign w:val="center"/>
-            <w:tcMar>
-              <w:top w:w="90" w:type="dxa"/>
-              <w:left w:w="90" w:type="dxa"/>
-              <w:bottom w:w="90" w:type="dxa"/>
-              <w:right w:w="90" w:type="dxa"/>
-            </w:tcMar>
           </w:tcPr>
           <w:p>
             <w:pPr>
               <w:spacing w:after="40" w:line="240" w:lineRule="auto"/>
             </w:pPr>
-            <w:r/>
-            <w:r>
-              <w:rPr>
-                <w:b w:val="0"/>
-              </w:rPr>
+            <w:r>
+              <w:lastRenderedPageBreak/>
               <w:t>No</w:t>
             </w:r>
           </w:p>
         </w:tc>
         <w:tc>
           <w:tcPr>
-            <w:tcW w:type="dxa" w:w="2469"/>
+            <w:tcW w:w="2469" w:type="dxa"/>
+            <w:tcMar>
+              <w:top w:w="90" w:type="dxa"/>
+              <w:left w:w="90" w:type="dxa"/>
+              <w:bottom w:w="90" w:type="dxa"/>
+              <w:right w:w="90" w:type="dxa"/>
+            </w:tcMar>
             <w:vAlign w:val="center"/>
-            <w:tcMar>
-              <w:top w:w="90" w:type="dxa"/>
-              <w:left w:w="90" w:type="dxa"/>
-              <w:bottom w:w="90" w:type="dxa"/>
-              <w:right w:w="90" w:type="dxa"/>
-            </w:tcMar>
           </w:tcPr>
           <w:p>
             <w:pPr>
               <w:spacing w:after="40" w:line="240" w:lineRule="auto"/>
             </w:pPr>
-            <w:r/>
-            <w:r>
-              <w:rPr>
-                <w:b w:val="0"/>
-              </w:rPr>
-              <w:t>Global process-level comparator</w:t>
-            </w:r>
-          </w:p>
-        </w:tc>
-        <w:tc>
-          <w:tcPr>
-            <w:tcW w:type="dxa" w:w="2469"/>
+            <w:r>
+              <w:t xml:space="preserve">Global process-level </w:t>
+            </w:r>
+            <w:r>
+              <w:lastRenderedPageBreak/>
+              <w:t>comparator</w:t>
+            </w:r>
+          </w:p>
+        </w:tc>
+        <w:tc>
+          <w:tcPr>
+            <w:tcW w:w="2469" w:type="dxa"/>
+            <w:tcMar>
+              <w:top w:w="90" w:type="dxa"/>
+              <w:left w:w="90" w:type="dxa"/>
+              <w:bottom w:w="90" w:type="dxa"/>
+              <w:right w:w="90" w:type="dxa"/>
+            </w:tcMar>
             <w:vAlign w:val="center"/>
-            <w:tcMar>
-              <w:top w:w="90" w:type="dxa"/>
-              <w:left w:w="90" w:type="dxa"/>
-              <w:bottom w:w="90" w:type="dxa"/>
-              <w:right w:w="90" w:type="dxa"/>
-            </w:tcMar>
           </w:tcPr>
           <w:p>
             <w:pPr>
               <w:spacing w:after="40" w:line="240" w:lineRule="auto"/>
             </w:pPr>
-            <w:r/>
-            <w:r>
-              <w:rPr>
-                <w:b w:val="0"/>
-              </w:rPr>
-              <w:t>Outside scope; would require a separate full-cone optimization or analytic bound</w:t>
+            <w:r>
+              <w:lastRenderedPageBreak/>
+              <w:t>Outside scope; would require a separate full-</w:t>
+            </w:r>
+            <w:r>
+              <w:lastRenderedPageBreak/>
+              <w:t>cone optimization or analytic bound</w:t>
             </w:r>
           </w:p>
         </w:tc>
@@ -2927,6 +2845,7 @@
           <w:b/>
           <w:sz w:val="18"/>
         </w:rPr>
+        <w:lastRenderedPageBreak/>
         <w:t>Table IV. Verified benchmark claims carried into the main text.</w:t>
       </w:r>
     </w:p>
@@ -3623,9 +3542,9 @@
     <w:tbl>
       <w:tblPr>
         <w:tblStyle w:val="TableGrid"/>
-        <w:tblW w:type="auto" w:w="0"/>
+        <w:tblW w:w="0" w:type="auto"/>
         <w:jc w:val="center"/>
-        <w:tblLook w:firstColumn="1" w:firstRow="1" w:lastColumn="0" w:lastRow="0" w:noHBand="0" w:noVBand="1" w:val="04A0"/>
+        <w:tblLook w:val="04A0" w:firstRow="1" w:lastRow="0" w:firstColumn="1" w:lastColumn="0" w:noHBand="0" w:noVBand="1"/>
       </w:tblPr>
       <w:tblGrid>
         <w:gridCol w:w="2469"/>
@@ -3634,27 +3553,25 @@
         <w:gridCol w:w="2469"/>
       </w:tblGrid>
       <w:tr>
-        <w:tc>
-          <w:tcPr>
-            <w:tcW w:type="dxa" w:w="2469"/>
+        <w:trPr>
+          <w:jc w:val="center"/>
+        </w:trPr>
+        <w:tc>
+          <w:tcPr>
+            <w:tcW w:w="2469" w:type="dxa"/>
+            <w:shd w:val="clear" w:color="auto" w:fill="D9EAF7"/>
+            <w:tcMar>
+              <w:top w:w="90" w:type="dxa"/>
+              <w:left w:w="90" w:type="dxa"/>
+              <w:bottom w:w="90" w:type="dxa"/>
+              <w:right w:w="90" w:type="dxa"/>
+            </w:tcMar>
             <w:vAlign w:val="center"/>
-            <w:tcMar>
-              <w:top w:w="90" w:type="dxa"/>
-              <w:left w:w="90" w:type="dxa"/>
-              <w:bottom w:w="90" w:type="dxa"/>
-              <w:right w:w="90" w:type="dxa"/>
-            </w:tcMar>
-            <w:shd w:fill="D9EAF7"/>
           </w:tcPr>
           <w:p>
             <w:pPr>
               <w:spacing w:after="40" w:line="240" w:lineRule="auto"/>
             </w:pPr>
-            <w:r>
-              <w:rPr>
-                <w:b/>
-              </w:rPr>
-            </w:r>
             <w:r>
               <w:rPr>
                 <w:b/>
@@ -3665,25 +3582,20 @@
         </w:tc>
         <w:tc>
           <w:tcPr>
-            <w:tcW w:type="dxa" w:w="2469"/>
+            <w:tcW w:w="2469" w:type="dxa"/>
+            <w:shd w:val="clear" w:color="auto" w:fill="D9EAF7"/>
+            <w:tcMar>
+              <w:top w:w="90" w:type="dxa"/>
+              <w:left w:w="90" w:type="dxa"/>
+              <w:bottom w:w="90" w:type="dxa"/>
+              <w:right w:w="90" w:type="dxa"/>
+            </w:tcMar>
             <w:vAlign w:val="center"/>
-            <w:tcMar>
-              <w:top w:w="90" w:type="dxa"/>
-              <w:left w:w="90" w:type="dxa"/>
-              <w:bottom w:w="90" w:type="dxa"/>
-              <w:right w:w="90" w:type="dxa"/>
-            </w:tcMar>
-            <w:shd w:fill="D9EAF7"/>
           </w:tcPr>
           <w:p>
             <w:pPr>
               <w:spacing w:after="40" w:line="240" w:lineRule="auto"/>
             </w:pPr>
-            <w:r>
-              <w:rPr>
-                <w:b/>
-              </w:rPr>
-            </w:r>
             <w:r>
               <w:rPr>
                 <w:b/>
@@ -3694,25 +3606,20 @@
         </w:tc>
         <w:tc>
           <w:tcPr>
-            <w:tcW w:type="dxa" w:w="2469"/>
+            <w:tcW w:w="2469" w:type="dxa"/>
+            <w:shd w:val="clear" w:color="auto" w:fill="D9EAF7"/>
+            <w:tcMar>
+              <w:top w:w="90" w:type="dxa"/>
+              <w:left w:w="90" w:type="dxa"/>
+              <w:bottom w:w="90" w:type="dxa"/>
+              <w:right w:w="90" w:type="dxa"/>
+            </w:tcMar>
             <w:vAlign w:val="center"/>
-            <w:tcMar>
-              <w:top w:w="90" w:type="dxa"/>
-              <w:left w:w="90" w:type="dxa"/>
-              <w:bottom w:w="90" w:type="dxa"/>
-              <w:right w:w="90" w:type="dxa"/>
-            </w:tcMar>
-            <w:shd w:fill="D9EAF7"/>
           </w:tcPr>
           <w:p>
             <w:pPr>
               <w:spacing w:after="40" w:line="240" w:lineRule="auto"/>
             </w:pPr>
-            <w:r>
-              <w:rPr>
-                <w:b/>
-              </w:rPr>
-            </w:r>
             <w:r>
               <w:rPr>
                 <w:b/>
@@ -3723,25 +3630,20 @@
         </w:tc>
         <w:tc>
           <w:tcPr>
-            <w:tcW w:type="dxa" w:w="2469"/>
+            <w:tcW w:w="2469" w:type="dxa"/>
+            <w:shd w:val="clear" w:color="auto" w:fill="D9EAF7"/>
+            <w:tcMar>
+              <w:top w:w="90" w:type="dxa"/>
+              <w:left w:w="90" w:type="dxa"/>
+              <w:bottom w:w="90" w:type="dxa"/>
+              <w:right w:w="90" w:type="dxa"/>
+            </w:tcMar>
             <w:vAlign w:val="center"/>
-            <w:tcMar>
-              <w:top w:w="90" w:type="dxa"/>
-              <w:left w:w="90" w:type="dxa"/>
-              <w:bottom w:w="90" w:type="dxa"/>
-              <w:right w:w="90" w:type="dxa"/>
-            </w:tcMar>
-            <w:shd w:fill="D9EAF7"/>
           </w:tcPr>
           <w:p>
             <w:pPr>
               <w:spacing w:after="40" w:line="240" w:lineRule="auto"/>
             </w:pPr>
-            <w:r>
-              <w:rPr>
-                <w:b/>
-              </w:rPr>
-            </w:r>
             <w:r>
               <w:rPr>
                 <w:b/>
@@ -3752,392 +3654,341 @@
         </w:tc>
       </w:tr>
       <w:tr>
-        <w:tc>
-          <w:tcPr>
-            <w:tcW w:type="dxa" w:w="2469"/>
+        <w:trPr>
+          <w:jc w:val="center"/>
+        </w:trPr>
+        <w:tc>
+          <w:tcPr>
+            <w:tcW w:w="2469" w:type="dxa"/>
+            <w:tcMar>
+              <w:top w:w="90" w:type="dxa"/>
+              <w:left w:w="90" w:type="dxa"/>
+              <w:bottom w:w="90" w:type="dxa"/>
+              <w:right w:w="90" w:type="dxa"/>
+            </w:tcMar>
             <w:vAlign w:val="center"/>
-            <w:tcMar>
-              <w:top w:w="90" w:type="dxa"/>
-              <w:left w:w="90" w:type="dxa"/>
-              <w:bottom w:w="90" w:type="dxa"/>
-              <w:right w:w="90" w:type="dxa"/>
-            </w:tcMar>
           </w:tcPr>
           <w:p>
             <w:pPr>
               <w:spacing w:after="40" w:line="240" w:lineRule="auto"/>
             </w:pPr>
-            <w:r/>
-            <w:r>
-              <w:rPr>
-                <w:b w:val="0"/>
-              </w:rPr>
+            <w:r>
               <w:t>Primary task</w:t>
             </w:r>
           </w:p>
         </w:tc>
         <w:tc>
           <w:tcPr>
-            <w:tcW w:type="dxa" w:w="2469"/>
+            <w:tcW w:w="2469" w:type="dxa"/>
+            <w:tcMar>
+              <w:top w:w="90" w:type="dxa"/>
+              <w:left w:w="90" w:type="dxa"/>
+              <w:bottom w:w="90" w:type="dxa"/>
+              <w:right w:w="90" w:type="dxa"/>
+            </w:tcMar>
             <w:vAlign w:val="center"/>
-            <w:tcMar>
-              <w:top w:w="90" w:type="dxa"/>
-              <w:left w:w="90" w:type="dxa"/>
-              <w:bottom w:w="90" w:type="dxa"/>
-              <w:right w:w="90" w:type="dxa"/>
-            </w:tcMar>
           </w:tcPr>
           <w:p>
             <w:pPr>
               <w:spacing w:after="40" w:line="240" w:lineRule="auto"/>
             </w:pPr>
-            <w:r/>
-            <w:r>
-              <w:rPr>
-                <w:b w:val="0"/>
-              </w:rPr>
+            <w:r>
               <w:t>One-shot classical-message transmission</w:t>
             </w:r>
           </w:p>
         </w:tc>
         <w:tc>
           <w:tcPr>
-            <w:tcW w:type="dxa" w:w="2469"/>
+            <w:tcW w:w="2469" w:type="dxa"/>
+            <w:tcMar>
+              <w:top w:w="90" w:type="dxa"/>
+              <w:left w:w="90" w:type="dxa"/>
+              <w:bottom w:w="90" w:type="dxa"/>
+              <w:right w:w="90" w:type="dxa"/>
+            </w:tcMar>
             <w:vAlign w:val="center"/>
-            <w:tcMar>
-              <w:top w:w="90" w:type="dxa"/>
-              <w:left w:w="90" w:type="dxa"/>
-              <w:bottom w:w="90" w:type="dxa"/>
-              <w:right w:w="90" w:type="dxa"/>
-            </w:tcMar>
           </w:tcPr>
           <w:p>
             <w:pPr>
               <w:spacing w:after="40" w:line="240" w:lineRule="auto"/>
             </w:pPr>
-            <w:r/>
-            <w:r>
-              <w:rPr>
-                <w:b w:val="0"/>
-              </w:rPr>
+            <w:r>
               <w:t>Environmental-record access, redundancy, and binary discrimination</w:t>
             </w:r>
           </w:p>
         </w:tc>
         <w:tc>
           <w:tcPr>
-            <w:tcW w:type="dxa" w:w="2469"/>
+            <w:tcW w:w="2469" w:type="dxa"/>
+            <w:tcMar>
+              <w:top w:w="90" w:type="dxa"/>
+              <w:left w:w="90" w:type="dxa"/>
+              <w:bottom w:w="90" w:type="dxa"/>
+              <w:right w:w="90" w:type="dxa"/>
+            </w:tcMar>
             <w:vAlign w:val="center"/>
-            <w:tcMar>
-              <w:top w:w="90" w:type="dxa"/>
-              <w:left w:w="90" w:type="dxa"/>
-              <w:bottom w:w="90" w:type="dxa"/>
-              <w:right w:w="90" w:type="dxa"/>
-            </w:tcMar>
           </w:tcPr>
           <w:p>
             <w:pPr>
               <w:spacing w:after="40" w:line="240" w:lineRule="auto"/>
             </w:pPr>
-            <w:r/>
-            <w:r>
-              <w:rPr>
-                <w:b w:val="0"/>
-              </w:rPr>
+            <w:r>
               <w:t>Advantages are task indexed, not universal</w:t>
             </w:r>
           </w:p>
         </w:tc>
       </w:tr>
       <w:tr>
-        <w:tc>
-          <w:tcPr>
-            <w:tcW w:type="dxa" w:w="2469"/>
+        <w:trPr>
+          <w:jc w:val="center"/>
+        </w:trPr>
+        <w:tc>
+          <w:tcPr>
+            <w:tcW w:w="2469" w:type="dxa"/>
+            <w:tcMar>
+              <w:top w:w="90" w:type="dxa"/>
+              <w:left w:w="90" w:type="dxa"/>
+              <w:bottom w:w="90" w:type="dxa"/>
+              <w:right w:w="90" w:type="dxa"/>
+            </w:tcMar>
             <w:vAlign w:val="center"/>
-            <w:tcMar>
-              <w:top w:w="90" w:type="dxa"/>
-              <w:left w:w="90" w:type="dxa"/>
-              <w:bottom w:w="90" w:type="dxa"/>
-              <w:right w:w="90" w:type="dxa"/>
-            </w:tcMar>
           </w:tcPr>
           <w:p>
             <w:pPr>
               <w:spacing w:after="40" w:line="240" w:lineRule="auto"/>
             </w:pPr>
-            <w:r/>
-            <w:r>
-              <w:rPr>
-                <w:b w:val="0"/>
-              </w:rPr>
+            <w:r>
               <w:t>Accessible systems</w:t>
             </w:r>
           </w:p>
         </w:tc>
         <w:tc>
           <w:tcPr>
-            <w:tcW w:type="dxa" w:w="2469"/>
+            <w:tcW w:w="2469" w:type="dxa"/>
+            <w:tcMar>
+              <w:top w:w="90" w:type="dxa"/>
+              <w:left w:w="90" w:type="dxa"/>
+              <w:bottom w:w="90" w:type="dxa"/>
+              <w:right w:w="90" w:type="dxa"/>
+            </w:tcMar>
             <w:vAlign w:val="center"/>
-            <w:tcMar>
-              <w:top w:w="90" w:type="dxa"/>
-              <w:left w:w="90" w:type="dxa"/>
-              <w:bottom w:w="90" w:type="dxa"/>
-              <w:right w:w="90" w:type="dxa"/>
-            </w:tcMar>
           </w:tcPr>
           <w:p>
             <w:pPr>
               <w:spacing w:after="40" w:line="240" w:lineRule="auto"/>
             </w:pPr>
-            <w:r/>
-            <w:r>
-              <w:rPr>
-                <w:b w:val="0"/>
-              </w:rPr>
+            <w:r>
               <w:t>Communication resources in the controlled-order protocol</w:t>
             </w:r>
           </w:p>
         </w:tc>
         <w:tc>
           <w:tcPr>
-            <w:tcW w:type="dxa" w:w="2469"/>
+            <w:tcW w:w="2469" w:type="dxa"/>
+            <w:tcMar>
+              <w:top w:w="90" w:type="dxa"/>
+              <w:left w:w="90" w:type="dxa"/>
+              <w:bottom w:w="90" w:type="dxa"/>
+              <w:right w:w="90" w:type="dxa"/>
+            </w:tcMar>
             <w:vAlign w:val="center"/>
-            <w:tcMar>
-              <w:top w:w="90" w:type="dxa"/>
-              <w:left w:w="90" w:type="dxa"/>
-              <w:bottom w:w="90" w:type="dxa"/>
-              <w:right w:w="90" w:type="dxa"/>
-            </w:tcMar>
           </w:tcPr>
           <w:p>
             <w:pPr>
               <w:spacing w:after="40" w:line="240" w:lineRule="auto"/>
             </w:pPr>
-            <w:r/>
-            <w:r>
-              <w:rPr>
-                <w:b w:val="0"/>
-              </w:rPr>
+            <w:r>
               <w:t>Fragment F, joint T+F access, dephased T, discarded T, or postselected outcomes</w:t>
             </w:r>
           </w:p>
         </w:tc>
         <w:tc>
           <w:tcPr>
-            <w:tcW w:type="dxa" w:w="2469"/>
+            <w:tcW w:w="2469" w:type="dxa"/>
+            <w:tcMar>
+              <w:top w:w="90" w:type="dxa"/>
+              <w:left w:w="90" w:type="dxa"/>
+              <w:bottom w:w="90" w:type="dxa"/>
+              <w:right w:w="90" w:type="dxa"/>
+            </w:tcMar>
             <w:vAlign w:val="center"/>
-            <w:tcMar>
-              <w:top w:w="90" w:type="dxa"/>
-              <w:left w:w="90" w:type="dxa"/>
-              <w:bottom w:w="90" w:type="dxa"/>
-              <w:right w:w="90" w:type="dxa"/>
-            </w:tcMar>
           </w:tcPr>
           <w:p>
             <w:pPr>
               <w:spacing w:after="40" w:line="240" w:lineRule="auto"/>
             </w:pPr>
-            <w:r/>
-            <w:r>
-              <w:rPr>
-                <w:b w:val="0"/>
-              </w:rPr>
+            <w:r>
               <w:t>Access restrictions determine which contribution survives</w:t>
             </w:r>
           </w:p>
         </w:tc>
       </w:tr>
       <w:tr>
-        <w:tc>
-          <w:tcPr>
-            <w:tcW w:type="dxa" w:w="2469"/>
+        <w:trPr>
+          <w:jc w:val="center"/>
+        </w:trPr>
+        <w:tc>
+          <w:tcPr>
+            <w:tcW w:w="2469" w:type="dxa"/>
+            <w:tcMar>
+              <w:top w:w="90" w:type="dxa"/>
+              <w:left w:w="90" w:type="dxa"/>
+              <w:bottom w:w="90" w:type="dxa"/>
+              <w:right w:w="90" w:type="dxa"/>
+            </w:tcMar>
             <w:vAlign w:val="center"/>
-            <w:tcMar>
-              <w:top w:w="90" w:type="dxa"/>
-              <w:left w:w="90" w:type="dxa"/>
-              <w:bottom w:w="90" w:type="dxa"/>
-              <w:right w:w="90" w:type="dxa"/>
-            </w:tcMar>
           </w:tcPr>
           <w:p>
             <w:pPr>
               <w:spacing w:after="40" w:line="240" w:lineRule="auto"/>
             </w:pPr>
-            <w:r/>
-            <w:r>
-              <w:rPr>
-                <w:b w:val="0"/>
-              </w:rPr>
+            <w:r>
               <w:t>Main positive result</w:t>
             </w:r>
           </w:p>
         </w:tc>
         <w:tc>
           <w:tcPr>
-            <w:tcW w:type="dxa" w:w="2469"/>
+            <w:tcW w:w="2469" w:type="dxa"/>
+            <w:tcMar>
+              <w:top w:w="90" w:type="dxa"/>
+              <w:left w:w="90" w:type="dxa"/>
+              <w:bottom w:w="90" w:type="dxa"/>
+              <w:right w:w="90" w:type="dxa"/>
+            </w:tcMar>
             <w:vAlign w:val="center"/>
-            <w:tcMar>
-              <w:top w:w="90" w:type="dxa"/>
-              <w:left w:w="90" w:type="dxa"/>
-              <w:bottom w:w="90" w:type="dxa"/>
-              <w:right w:w="90" w:type="dxa"/>
-            </w:tcMar>
           </w:tcPr>
           <w:p>
             <w:pPr>
               <w:spacing w:after="40" w:line="240" w:lineRule="auto"/>
             </w:pPr>
-            <w:r/>
-            <w:r>
-              <w:rPr>
-                <w:b w:val="0"/>
-              </w:rPr>
+            <w:r>
               <w:t>Controlled order can enhance communication in the declared framework</w:t>
             </w:r>
           </w:p>
         </w:tc>
         <w:tc>
           <w:tcPr>
-            <w:tcW w:type="dxa" w:w="2469"/>
+            <w:tcW w:w="2469" w:type="dxa"/>
+            <w:tcMar>
+              <w:top w:w="90" w:type="dxa"/>
+              <w:left w:w="90" w:type="dxa"/>
+              <w:bottom w:w="90" w:type="dxa"/>
+              <w:right w:w="90" w:type="dxa"/>
+            </w:tcMar>
             <w:vAlign w:val="center"/>
-            <w:tcMar>
-              <w:top w:w="90" w:type="dxa"/>
-              <w:left w:w="90" w:type="dxa"/>
-              <w:bottom w:w="90" w:type="dxa"/>
-              <w:right w:w="90" w:type="dxa"/>
-            </w:tcMar>
           </w:tcPr>
           <w:p>
             <w:pPr>
               <w:spacing w:after="40" w:line="240" w:lineRule="auto"/>
             </w:pPr>
-            <w:r/>
-            <w:r>
-              <w:rPr>
-                <w:b w:val="0"/>
-              </w:rPr>
+            <w:r>
               <w:t>Joint T+fragment Holevo information gains 0.083977 bit in the matched family</w:t>
             </w:r>
           </w:p>
         </w:tc>
         <w:tc>
           <w:tcPr>
-            <w:tcW w:type="dxa" w:w="2469"/>
+            <w:tcW w:w="2469" w:type="dxa"/>
+            <w:tcMar>
+              <w:top w:w="90" w:type="dxa"/>
+              <w:left w:w="90" w:type="dxa"/>
+              <w:bottom w:w="90" w:type="dxa"/>
+              <w:right w:w="90" w:type="dxa"/>
+            </w:tcMar>
             <w:vAlign w:val="center"/>
-            <w:tcMar>
-              <w:top w:w="90" w:type="dxa"/>
-              <w:left w:w="90" w:type="dxa"/>
-              <w:bottom w:w="90" w:type="dxa"/>
-              <w:right w:w="90" w:type="dxa"/>
-            </w:tcMar>
           </w:tcPr>
           <w:p>
             <w:pPr>
               <w:spacing w:after="40" w:line="240" w:lineRule="auto"/>
             </w:pPr>
-            <w:r/>
-            <w:r>
-              <w:rPr>
-                <w:b w:val="0"/>
-              </w:rPr>
+            <w:r>
               <w:t>Joint access can help without creating fragment-only objectivity</w:t>
             </w:r>
           </w:p>
         </w:tc>
       </w:tr>
       <w:tr>
-        <w:tc>
-          <w:tcPr>
-            <w:tcW w:type="dxa" w:w="2469"/>
+        <w:trPr>
+          <w:jc w:val="center"/>
+        </w:trPr>
+        <w:tc>
+          <w:tcPr>
+            <w:tcW w:w="2469" w:type="dxa"/>
+            <w:tcMar>
+              <w:top w:w="90" w:type="dxa"/>
+              <w:left w:w="90" w:type="dxa"/>
+              <w:bottom w:w="90" w:type="dxa"/>
+              <w:right w:w="90" w:type="dxa"/>
+            </w:tcMar>
             <w:vAlign w:val="center"/>
-            <w:tcMar>
-              <w:top w:w="90" w:type="dxa"/>
-              <w:left w:w="90" w:type="dxa"/>
-              <w:bottom w:w="90" w:type="dxa"/>
-              <w:right w:w="90" w:type="dxa"/>
-            </w:tcMar>
           </w:tcPr>
           <w:p>
             <w:pPr>
               <w:spacing w:after="40" w:line="240" w:lineRule="auto"/>
             </w:pPr>
-            <w:r/>
-            <w:r>
-              <w:rPr>
-                <w:b w:val="0"/>
-              </w:rPr>
+            <w:r>
+              <w:lastRenderedPageBreak/>
               <w:t>Main limiting result</w:t>
             </w:r>
           </w:p>
         </w:tc>
         <w:tc>
           <w:tcPr>
-            <w:tcW w:type="dxa" w:w="2469"/>
+            <w:tcW w:w="2469" w:type="dxa"/>
+            <w:tcMar>
+              <w:top w:w="90" w:type="dxa"/>
+              <w:left w:w="90" w:type="dxa"/>
+              <w:bottom w:w="90" w:type="dxa"/>
+              <w:right w:w="90" w:type="dxa"/>
+            </w:tcMar>
             <w:vAlign w:val="center"/>
-            <w:tcMar>
-              <w:top w:w="90" w:type="dxa"/>
-              <w:left w:w="90" w:type="dxa"/>
-              <w:bottom w:w="90" w:type="dxa"/>
-              <w:right w:w="90" w:type="dxa"/>
-            </w:tcMar>
           </w:tcPr>
           <w:p>
             <w:pPr>
               <w:spacing w:after="40" w:line="240" w:lineRule="auto"/>
             </w:pPr>
-            <w:r/>
-            <w:r>
-              <w:rPr>
-                <w:b w:val="0"/>
-              </w:rPr>
+            <w:r>
               <w:t>Asymptotic limits relative to shared entanglement are identified</w:t>
             </w:r>
           </w:p>
         </w:tc>
         <w:tc>
           <w:tcPr>
-            <w:tcW w:type="dxa" w:w="2469"/>
+            <w:tcW w:w="2469" w:type="dxa"/>
+            <w:tcMar>
+              <w:top w:w="90" w:type="dxa"/>
+              <w:left w:w="90" w:type="dxa"/>
+              <w:bottom w:w="90" w:type="dxa"/>
+              <w:right w:w="90" w:type="dxa"/>
+            </w:tcMar>
             <w:vAlign w:val="center"/>
-            <w:tcMar>
-              <w:top w:w="90" w:type="dxa"/>
-              <w:left w:w="90" w:type="dxa"/>
-              <w:bottom w:w="90" w:type="dxa"/>
-              <w:right w:w="90" w:type="dxa"/>
-            </w:tcMar>
           </w:tcPr>
           <w:p>
             <w:pPr>
               <w:spacing w:after="40" w:line="240" w:lineRule="auto"/>
             </w:pPr>
-            <w:r/>
-            <w:r>
-              <w:rPr>
-                <w:b w:val="0"/>
-              </w:rPr>
+            <w:r>
               <w:t>Equal-prior Helstrom neutrality and no coherent fragment-only redundancy advantage in tested class</w:t>
             </w:r>
           </w:p>
         </w:tc>
         <w:tc>
           <w:tcPr>
-            <w:tcW w:type="dxa" w:w="2469"/>
+            <w:tcW w:w="2469" w:type="dxa"/>
+            <w:tcMar>
+              <w:top w:w="90" w:type="dxa"/>
+              <w:left w:w="90" w:type="dxa"/>
+              <w:bottom w:w="90" w:type="dxa"/>
+              <w:right w:w="90" w:type="dxa"/>
+            </w:tcMar>
             <w:vAlign w:val="center"/>
-            <w:tcMar>
-              <w:top w:w="90" w:type="dxa"/>
-              <w:left w:w="90" w:type="dxa"/>
-              <w:bottom w:w="90" w:type="dxa"/>
-              <w:right w:w="90" w:type="dxa"/>
-            </w:tcMar>
           </w:tcPr>
           <w:p>
             <w:pPr>
               <w:spacing w:after="40" w:line="240" w:lineRule="auto"/>
             </w:pPr>
-            <w:r/>
-            <w:r>
-              <w:rPr>
-                <w:b w:val="0"/>
-              </w:rPr>
+            <w:r>
               <w:t>Controlled order should not be treated as a generic source of objective records</w:t>
             </w:r>
           </w:p>
@@ -4203,7 +4054,6 @@
               <w:rPr>
                 <w:b/>
               </w:rPr>
-              <w:lastRenderedPageBreak/>
               <w:t>Domain</w:t>
             </w:r>
           </w:p>
@@ -4651,6 +4501,7 @@
         <w:pStyle w:val="Heading2"/>
       </w:pPr>
       <w:r>
+        <w:lastRenderedPageBreak/>
         <w:t>Proposition 1. Ancilla stability and witness pullback</w:t>
       </w:r>
     </w:p>
@@ -4708,7 +4559,6 @@
     </w:p>
     <w:p>
       <w:r>
-        <w:lastRenderedPageBreak/>
         <w:t>Therefore S_ext is nonnegative on the separable cone and negative on W_ext. If W_ext itself were causally separable, closure under R would make W_sw causally separable, a contradiction. Thus the extended process remains causally nonseparable. □</w:t>
       </w:r>
     </w:p>
@@ -4818,6 +4668,7 @@
         <w:pStyle w:val="Heading2"/>
       </w:pPr>
       <w:r>
+        <w:lastRenderedPageBreak/>
         <w:t>A. Circuit-level statevector validation</w:t>
       </w:r>
     </w:p>
@@ -4836,7 +4687,6 @@
         <w:pStyle w:val="Heading2"/>
       </w:pPr>
       <w:r>
-        <w:lastRenderedPageBreak/>
         <w:t>B. Reduced-normal-form verification</w:t>
       </w:r>
     </w:p>
@@ -5371,6 +5221,7 @@
         <w:rPr>
           <w:noProof/>
         </w:rPr>
+        <w:lastRenderedPageBreak/>
         <w:drawing>
           <wp:inline distT="0" distB="0" distL="0" distR="0" wp14:anchorId="067D5270" wp14:editId="10D035C2">
             <wp:extent cx="6035040" cy="2284836"/>
@@ -5463,7 +5314,6 @@
                 <w:b/>
                 <w:sz w:val="17"/>
               </w:rPr>
-              <w:lastRenderedPageBreak/>
               <w:t>Arm</w:t>
             </w:r>
           </w:p>
@@ -5965,7 +5815,11 @@
     </w:p>
     <w:p>
       <w:r>
-        <w:t>Environmental objectivity and causal nonseparability are independent operational structures. That independence is the central result: a process can carry redundant environmental records without causal nonseparability, and a causally nonseparable process need not create objective records. When record-generating operations are coherently ordered, branchwise pointer compatibility determines deterministic preservation, while the control provides a bounded joint-access information resource. The resource can increase Holevo information for T+F without improving equal-prior binary discrimination or fragment-only redundancy. Postselection is probability constrained, record replication does not make the bonus extensive, and deterministic local record outputs preserve an independently certified causal witness as a supporting consistency check.</w:t>
+        <w:t xml:space="preserve">Environmental objectivity and causal nonseparability are independent operational structures. That independence is the central result: a process can carry redundant environmental records without causal nonseparability, and a causally nonseparable process need not create objective records. When record-generating operations are coherently ordered, branchwise pointer compatibility determines deterministic preservation, while the control provides a bounded joint-access information resource. The resource can increase Holevo information for T+F without improving equal-prior </w:t>
+      </w:r>
+      <w:r>
+        <w:lastRenderedPageBreak/>
+        <w:t>binary discrimination or fragment-only redundancy. Postselection is probability constrained, record replication does not make the bonus extensive, and deterministic local record outputs preserve an independently certified causal witness as a supporting consistency check.</w:t>
       </w:r>
     </w:p>
     <w:p>
@@ -5983,13 +5837,22 @@
     </w:p>
     <w:p>
       <w:r>
-        <w:t>All deterministic scripts, prediction tables, exact matrix outputs, finite-shot computational counts, interval calculations, local simulator outputs, theorem certificates, reports, and checksums assembled for this submission are included in the accompanying reproducibility package. The package includes machine-readable numerical validation outputs and simulation-generated finite-shot data but no measurements from a physical quantum processor. The public archive is cited as: S. Muniz, Causal Nonseparability and Environmental Objectivity Reproducibility Package, Version 6.0, Zenodo (2026), DOI: 10.5281/zenodo.21933737.</w:t>
+        <w:t xml:space="preserve">All deterministic scripts, prediction tables, exact matrix outputs, finite-shot computational counts, interval calculations, local simulator outputs, theorem certificates, reports, and checksums assembled for this submission are included in the accompanying reproducibility package. The package includes machine-readable numerical validation outputs and simulation-generated finite-shot data but no measurements from a physical quantum processor. The public archive is cited as: S. Muniz, Causal Nonseparability and Environmental Objectivity Reproducibility Package, Version 6.0, </w:t>
       </w:r>
       <w:proofErr w:type="spellStart"/>
-      <w:r/>
+      <w:r>
+        <w:t>Zenodo</w:t>
+      </w:r>
       <w:proofErr w:type="spellEnd"/>
-      <w:r/>
-      <w:r/>
+      <w:r>
+        <w:t xml:space="preserve"> (2026), DOI: </w:t>
+      </w:r>
+      <w:r>
+        <w:t>10.5281/zenodo.21936044</w:t>
+      </w:r>
+      <w:r>
+        <w:t>.</w:t>
+      </w:r>
     </w:p>
     <w:p>
       <w:pPr>
@@ -6003,7 +5866,6 @@
       <w:r>
         <w:t>S.M. is the sole author, conceived and directed the research, and takes responsibility for the manuscript and its claims. The author is affiliated with Dr. Ware Technology Services and declares no competing interests. Microsoft 365 Copilot assisted with language editing, code review, bibliographic organization, consistency analysis, and draft preparation. All mathematical derivations, numerical outputs, references, and scientific claims were independently verified by the author. No AI system is an author.</w:t>
       </w:r>
-      <w:r/>
     </w:p>
     <w:p>
       <w:pPr>
@@ -6518,11 +6380,7 @@
             <w:pPr>
               <w:spacing w:after="40" w:line="240" w:lineRule="auto"/>
             </w:pPr>
-            <w:r/>
-            <w:r>
-              <w:rPr>
-                <w:b w:val="0"/>
-              </w:rPr>
+            <w:r>
               <w:t>Supporting witness pullback</w:t>
             </w:r>
           </w:p>
@@ -6542,11 +6400,7 @@
             <w:pPr>
               <w:spacing w:after="40" w:line="240" w:lineRule="auto"/>
             </w:pPr>
-            <w:r/>
-            <w:r>
-              <w:rPr>
-                <w:b w:val="0"/>
-              </w:rPr>
+            <w:r>
               <w:t>Process-space assumptions and witness certificate</w:t>
             </w:r>
           </w:p>
@@ -6566,11 +6420,7 @@
             <w:pPr>
               <w:spacing w:after="40" w:line="240" w:lineRule="auto"/>
             </w:pPr>
-            <w:r/>
-            <w:r>
-              <w:rPr>
-                <w:b w:val="0"/>
-              </w:rPr>
+            <w:r>
               <w:t>Proposition 1 and Eqs. (14)-(17)</w:t>
             </w:r>
           </w:p>
@@ -6599,6 +6449,7 @@
               <w:rPr>
                 <w:sz w:val="16"/>
               </w:rPr>
+              <w:lastRenderedPageBreak/>
               <w:t>Four-qubit route</w:t>
             </w:r>
           </w:p>
@@ -6881,11 +6732,7 @@
             <w:pPr>
               <w:spacing w:after="40" w:line="240" w:lineRule="auto"/>
             </w:pPr>
-            <w:r/>
-            <w:r>
-              <w:rPr>
-                <w:b w:val="0"/>
-              </w:rPr>
+            <w:r>
               <w:t>Version 6 manuscript validation</w:t>
             </w:r>
           </w:p>
@@ -6905,11 +6752,7 @@
             <w:pPr>
               <w:spacing w:after="40" w:line="240" w:lineRule="auto"/>
             </w:pPr>
-            <w:r/>
-            <w:r>
-              <w:rPr>
-                <w:b w:val="0"/>
-              </w:rPr>
+            <w:r>
               <w:t>Submission_Paper_PRXQ_V6.docx; v4_checksums.sha256; claim-to-artifact audit map</w:t>
             </w:r>
           </w:p>
@@ -6929,11 +6772,7 @@
             <w:pPr>
               <w:spacing w:after="40" w:line="240" w:lineRule="auto"/>
             </w:pPr>
-            <w:r/>
-            <w:r>
-              <w:rPr>
-                <w:b w:val="0"/>
-              </w:rPr>
+            <w:r>
               <w:t>Updated framing, comparator hierarchy, Definition 2 clarification, AI disclosure, DOI consistency, and validated numerical summaries</w:t>
             </w:r>
           </w:p>
@@ -6990,7 +6829,6 @@
         <w:ind w:left="317" w:hanging="317"/>
       </w:pPr>
       <w:r>
-        <w:lastRenderedPageBreak/>
         <w:t>[5] C. J. Riedel and W. H. Zurek, Quantum Darwinism in an Everyday Environment, Phys. Rev. Lett. 105, 020404 (2010).</w:t>
       </w:r>
     </w:p>
@@ -7071,6 +6909,7 @@
         <w:ind w:left="317" w:hanging="317"/>
       </w:pPr>
       <w:r>
+        <w:lastRenderedPageBreak/>
         <w:t>[15] M. Antesberger et al., Higher-Order Process Matrix Tomography of a Passively-Stable Quantum Switch, PRX Quantum 5, 010325 (2024).</w:t>
       </w:r>
     </w:p>
@@ -8058,6 +7897,7 @@
   <w:style w:type="character" w:default="1" w:styleId="DefaultParagraphFont">
     <w:name w:val="Default Paragraph Font"/>
     <w:uiPriority w:val="1"/>
+    <w:semiHidden/>
     <w:unhideWhenUsed/>
   </w:style>
   <w:style w:type="table" w:default="1" w:styleId="TableNormal">

</xml_diff>